<commit_message>
A2: transformers compat, fail-fast build checks, notebook subprocess fix
</commit_message>
<xml_diff>
--- a/forms/A2_form.docx
+++ b/forms/A2_form.docx
@@ -131,11 +131,9 @@
             <w:tcW w:type="dxa" w:w="5860"/>
           </w:tcPr>
           <w:p>
-            <w:pPr>
-              <w:spacing w:after="80"/>
-            </w:pPr>
-            <w:r>
-              <w:t xml:space="preserve"/>
+            <w:r/>
+            <w:r>
+              <w:t>PaperScholar</w:t>
             </w:r>
           </w:p>
         </w:tc>
@@ -288,11 +286,9 @@
             <w:tcW w:type="dxa" w:w="3000"/>
           </w:tcPr>
           <w:p>
-            <w:pPr>
-              <w:spacing w:after="80"/>
-            </w:pPr>
-            <w:r>
-              <w:t xml:space="preserve"/>
+            <w:r/>
+            <w:r>
+              <w:t>Aurchi Chowdhury</w:t>
             </w:r>
           </w:p>
         </w:tc>
@@ -301,11 +297,9 @@
             <w:tcW w:type="dxa" w:w="2360"/>
           </w:tcPr>
           <w:p>
-            <w:pPr>
-              <w:spacing w:after="80"/>
-            </w:pPr>
-            <w:r>
-              <w:t xml:space="preserve"/>
+            <w:r/>
+            <w:r>
+              <w:t>2105083</w:t>
             </w:r>
           </w:p>
         </w:tc>
@@ -314,11 +308,9 @@
             <w:tcW w:type="dxa" w:w="2300"/>
           </w:tcPr>
           <w:p>
-            <w:pPr>
-              <w:spacing w:after="80"/>
-            </w:pPr>
-            <w:r>
-              <w:t xml:space="preserve"/>
+            <w:r/>
+            <w:r>
+              <w:t>2, 3, 4, 8</w:t>
             </w:r>
           </w:p>
         </w:tc>
@@ -342,11 +334,9 @@
             <w:tcW w:type="dxa" w:w="3000"/>
           </w:tcPr>
           <w:p>
-            <w:pPr>
-              <w:spacing w:after="80"/>
-            </w:pPr>
-            <w:r>
-              <w:t xml:space="preserve"/>
+            <w:r/>
+            <w:r>
+              <w:t>Abrar Zahin Raihan</w:t>
             </w:r>
           </w:p>
         </w:tc>
@@ -355,11 +345,9 @@
             <w:tcW w:type="dxa" w:w="2360"/>
           </w:tcPr>
           <w:p>
-            <w:pPr>
-              <w:spacing w:after="80"/>
-            </w:pPr>
-            <w:r>
-              <w:t xml:space="preserve"/>
+            <w:r/>
+            <w:r>
+              <w:t>2105009</w:t>
             </w:r>
           </w:p>
         </w:tc>
@@ -368,11 +356,9 @@
             <w:tcW w:type="dxa" w:w="2300"/>
           </w:tcPr>
           <w:p>
-            <w:pPr>
-              <w:spacing w:after="80"/>
-            </w:pPr>
-            <w:r>
-              <w:t xml:space="preserve"/>
+            <w:r/>
+            <w:r>
+              <w:t>1, 5, 6, 7, 8</w:t>
             </w:r>
           </w:p>
         </w:tc>
@@ -396,11 +382,9 @@
             <w:tcW w:type="dxa" w:w="3000"/>
           </w:tcPr>
           <w:p>
-            <w:pPr>
-              <w:spacing w:after="80"/>
-            </w:pPr>
-            <w:r>
-              <w:t xml:space="preserve"/>
+            <w:r/>
+            <w:r>
+              <w:t>- (team of 2)</w:t>
             </w:r>
           </w:p>
         </w:tc>
@@ -409,11 +393,9 @@
             <w:tcW w:type="dxa" w:w="2360"/>
           </w:tcPr>
           <w:p>
-            <w:pPr>
-              <w:spacing w:after="80"/>
-            </w:pPr>
-            <w:r>
-              <w:t xml:space="preserve"/>
+            <w:r/>
+            <w:r>
+              <w:t>-</w:t>
             </w:r>
           </w:p>
         </w:tc>
@@ -422,11 +404,9 @@
             <w:tcW w:type="dxa" w:w="2300"/>
           </w:tcPr>
           <w:p>
-            <w:pPr>
-              <w:spacing w:after="80"/>
-            </w:pPr>
-            <w:r>
-              <w:t xml:space="preserve"/>
+            <w:r/>
+            <w:r>
+              <w:t>-</w:t>
             </w:r>
           </w:p>
         </w:tc>
@@ -577,11 +557,19 @@
             <w:tcW w:type="dxa" w:w="5860"/>
           </w:tcPr>
           <w:p>
-            <w:pPr>
-              <w:spacing w:after="80"/>
-            </w:pPr>
-            <w:r>
-              <w:t xml:space="preserve"/>
+            <w:r/>
+            <w:r>
+              <w:t>Domain: scientific literature triage - a PhD student or postdoc screening ~40 candidate papers to decide which five to read in full and which single reported quantity from each belongs in a related-work table.</w:t>
+            </w:r>
+          </w:p>
+          <w:p>
+            <w:r>
+              <w:t>Data speciality: dense multi-column scientific page layout - reading order is not visual order, and the answer often sits inside a figure, table or displayed equation rather than in prose.</w:t>
+            </w:r>
+          </w:p>
+          <w:p>
+            <w:r>
+              <w:t>Primary NFR: robustness, as a worst-stratum gap - answer-F1 must hold across page types, with F1(S1) - F1(S3) &lt;= 8, reported per stratum and never pooled.</w:t>
             </w:r>
           </w:p>
         </w:tc>
@@ -625,11 +613,9 @@
             <w:tcW w:type="dxa" w:w="5860"/>
           </w:tcPr>
           <w:p>
-            <w:pPr>
-              <w:spacing w:after="80"/>
-            </w:pPr>
-            <w:r>
-              <w:t xml:space="preserve"/>
+            <w:r/>
+            <w:r>
+              <w:t>Pooled answer-F1 &gt;= 0.70, computed over all strata together, with abstentions scored as neither correct nor incorrect and reported separately as an abstention rate. Unchanged from A1.</w:t>
             </w:r>
           </w:p>
         </w:tc>
@@ -673,11 +659,9 @@
             <w:tcW w:type="dxa" w:w="5860"/>
           </w:tcPr>
           <w:p>
-            <w:pPr>
-              <w:spacing w:after="80"/>
-            </w:pPr>
-            <w:r>
-              <w:t xml:space="preserve"/>
+            <w:r/>
+            <w:r>
+              <w:t>SciEGQA-Bench (80 arXiv papers, 1,823 pages, 788,265 words), pinned revision 9bdca77b. Hard property: layout, not language - 16.8% of pages are two-column where reading order is not visual order, and 56.1% of questions have their evidence inside a figure or table rather than in running prose.</w:t>
             </w:r>
           </w:p>
         </w:tc>
@@ -769,11 +753,9 @@
             <w:tcW w:type="dxa" w:w="5860"/>
           </w:tcPr>
           <w:p>
-            <w:pPr>
-              <w:spacing w:after="80"/>
-            </w:pPr>
-            <w:r>
-              <w:t xml:space="preserve"/>
+            <w:r/>
+            <w:r>
+              <w:t>Ink is locally correlated: neighbouring dark pixels form strokes, strokes form glyphs, and a glyph means the same thing wherever it sits on the page - so a convolutional or patch-based vision model can learn it once and reuse it everywhere. At the page scale the exploitable structure is whitespace: a scientific page is a small number of rectangular text blocks separated by margins and, on 16.8% of our pages, a vertical gutter. That gutter is the single most informative feature in this corpus, because it is what distinguishes 'two columns read in sequence' from 'one wide column'. Our layout stage exploits exactly this: a projection profile over horizontal bands finds the gutter, and figures and tables are large connected ink regions with different statistics from prose.</w:t>
             </w:r>
           </w:p>
         </w:tc>
@@ -817,11 +799,9 @@
             <w:tcW w:type="dxa" w:w="5860"/>
           </w:tcPr>
           <w:p>
-            <w:pPr>
-              <w:spacing w:after="80"/>
-            </w:pPr>
-            <w:r>
-              <w:t xml:space="preserve"/>
+            <w:r/>
+            <w:r>
+              <w:t>Scientific prose is highly predictable in sequence: word order carries meaning, section headings mark topic boundaries, and technical phrases recur ('we report', 'Table 3 shows'). A decoder-style model can therefore resolve an ambiguous glyph from context, which is why an encoder-decoder reader beats per-character classification on degraded or unusual notation. Mathematics adds structure a plain character model cannot use: superscripts, subscripts and fractions are two-dimensional relations, not a left-to-right string - which is why we read with a model that emits LaTeX rather than flat text. For retrieval, the exploitable structure is distributional: passages about the same quantity use overlapping vocabulary, so a sentence embedder places them near each other.</w:t>
             </w:r>
           </w:p>
         </w:tc>
@@ -865,11 +845,9 @@
             <w:tcW w:type="dxa" w:w="5860"/>
           </w:tcPr>
           <w:p>
-            <w:pPr>
-              <w:spacing w:after="80"/>
-            </w:pPr>
-            <w:r>
-              <w:t xml:space="preserve"/>
+            <w:r/>
+            <w:r>
+              <w:t>The answer must not change with: where a block sits on the page (a result is the same result in the left column or the right); page size (our corpus mixes US Letter, A4 and two smaller formats, which is why all coordinate handling uses the normalised rel_bbox and never absolute pixels); font and typeface across publishers and LaTeX classes; mild skew, scan noise and ink bleed; and the particular arXiv category a paper belongs to. Two of these we can state as measured invariances rather than hopes: page geometry, because coordinates are normalised, and category, because the corpus is exactly balanced at 10 documents per category. What SHOULD change the answer is the evidence region itself - so we deliberately do not make the system invariant to which box on the page it reads.</w:t>
             </w:r>
           </w:p>
         </w:tc>
@@ -1027,18 +1005,9 @@
             <w:tcW w:type="dxa" w:w="2900"/>
           </w:tcPr>
           <w:p>
-            <w:pPr>
-              <w:spacing w:after="80"/>
-            </w:pPr>
-            <w:r>
-              <w:rPr>
-                <w:i/>
-                <w:iCs/>
-                <w:color w:val="595959"/>
-                <w:sz w:val="18"/>
-                <w:szCs w:val="18"/>
-              </w:rPr>
-              <w:t xml:space="preserve">e.g. classical denoise vs VAE vs diffusion</w:t>
+            <w:r/>
+            <w:r>
+              <w:t>Classical denoise/deskew/binarize, a VAE denoiser, or a diffusion restorer - against doing nothing.</w:t>
             </w:r>
           </w:p>
         </w:tc>
@@ -1047,11 +1016,9 @@
             <w:tcW w:type="dxa" w:w="3200"/>
           </w:tcPr>
           <w:p>
-            <w:pPr>
-              <w:spacing w:after="80"/>
-            </w:pPr>
-            <w:r>
-              <w:t xml:space="preserve"/>
+            <w:r/>
+            <w:r>
+              <w:t>NONE, deliberately. Enhancement is bonus-tier and gated on degraded scans; these are born-digital 300-DPI renders with no skew, speckle or fading (only 0.7% of pages carry under 20 words). Classical restoration on clean glyphs only destroys them, and a learned enhancer would have nothing to learn from. enhance.enabled is set to false rather than left on.</w:t>
             </w:r>
           </w:p>
         </w:tc>
@@ -1060,11 +1027,9 @@
             <w:tcW w:type="dxa" w:w="1560"/>
           </w:tcPr>
           <w:p>
-            <w:pPr>
-              <w:spacing w:after="80"/>
-            </w:pPr>
-            <w:r>
-              <w:t xml:space="preserve"/>
+            <w:r/>
+            <w:r>
+              <w:t>no</w:t>
             </w:r>
           </w:p>
         </w:tc>
@@ -1088,18 +1053,9 @@
             <w:tcW w:type="dxa" w:w="2900"/>
           </w:tcPr>
           <w:p>
-            <w:pPr>
-              <w:spacing w:after="80"/>
-            </w:pPr>
-            <w:r>
-              <w:rPr>
-                <w:i/>
-                <w:iCs/>
-                <w:color w:val="595959"/>
-                <w:sz w:val="18"/>
-                <w:szCs w:val="18"/>
-              </w:rPr>
-              <w:t xml:space="preserve">e.g. heuristic vs detection model</w:t>
+            <w:r/>
+            <w:r>
+              <w:t>Naive top-to-bottom sort of detected blocks; whole-page morphological segmentation; a learned detector (DocLayout-YOLO / PP-DocLayout); projection-profile column detection.</w:t>
             </w:r>
           </w:p>
         </w:tc>
@@ -1108,11 +1064,9 @@
             <w:tcW w:type="dxa" w:w="3200"/>
           </w:tcPr>
           <w:p>
-            <w:pPr>
-              <w:spacing w:after="80"/>
-            </w:pPr>
-            <w:r>
-              <w:t xml:space="preserve"/>
+            <w:r/>
+            <w:r>
+              <w:t>Band-scanned projection profile for the gutter, plus the corpus's own figure/table boxes, ordered as: spanning band, then left column, then right. Measurement forced this. The column gap is ~12px at working resolution, narrower than the morphological kernel needed to join words into lines - so any purely morphological pass bridges the gutter and welds the two columns into one block, which is the exact failure this stage exists to prevent. And a whole-page projection fails when a wide figure sits above two columns, so we scan horizontal bands and require the gutter to persist across most of them. Verified by eye on 8 pages: 8/8.</w:t>
             </w:r>
           </w:p>
         </w:tc>
@@ -1121,11 +1075,9 @@
             <w:tcW w:type="dxa" w:w="1560"/>
           </w:tcPr>
           <w:p>
-            <w:pPr>
-              <w:spacing w:after="80"/>
-            </w:pPr>
-            <w:r>
-              <w:t xml:space="preserve"/>
+            <w:r/>
+            <w:r>
+              <w:t>no</w:t>
             </w:r>
           </w:p>
         </w:tc>
@@ -1149,18 +1101,9 @@
             <w:tcW w:type="dxa" w:w="2900"/>
           </w:tcPr>
           <w:p>
-            <w:pPr>
-              <w:spacing w:after="80"/>
-            </w:pPr>
-            <w:r>
-              <w:rPr>
-                <w:i/>
-                <w:iCs/>
-                <w:color w:val="595959"/>
-                <w:sz w:val="18"/>
-                <w:szCs w:val="18"/>
-              </w:rPr>
-              <w:t xml:space="preserve">e.g. Tesseract vs TrOCR vs Donut</w:t>
+            <w:r/>
+            <w:r>
+              <w:t>Tesseract (classical OCR), TrOCR (line-level encoder-decoder), Donut (OCR-free document understanding), Nougat (academic-document transformer).</w:t>
             </w:r>
           </w:p>
         </w:tc>
@@ -1169,11 +1112,9 @@
             <w:tcW w:type="dxa" w:w="3200"/>
           </w:tcPr>
           <w:p>
-            <w:pPr>
-              <w:spacing w:after="80"/>
-            </w:pPr>
-            <w:r>
-              <w:t xml:space="preserve"/>
+            <w:r/>
+            <w:r>
+              <w:t>Nougat (facebook/nougat-base), REPRODUCED from Blecher et al. 2023 (arXiv:2308.13418), run through HF transformers rather than the unmaintained nougat-ocr package. It is trained on arXiv page images - literally this corpus - emits Markdown with LaTeX for mathematics, and resolves two-column reading order internally. Tesseract loses every equation; TrOCR is line-level and would need our layout stage to feed it correctly ordered lines and would still lose the mathematics.</w:t>
             </w:r>
           </w:p>
         </w:tc>
@@ -1182,11 +1123,9 @@
             <w:tcW w:type="dxa" w:w="1560"/>
           </w:tcPr>
           <w:p>
-            <w:pPr>
-              <w:spacing w:after="80"/>
-            </w:pPr>
-            <w:r>
-              <w:t xml:space="preserve"/>
+            <w:r/>
+            <w:r>
+              <w:t>YES - reproduced</w:t>
             </w:r>
           </w:p>
         </w:tc>
@@ -1210,18 +1149,9 @@
             <w:tcW w:type="dxa" w:w="2900"/>
           </w:tcPr>
           <w:p>
-            <w:pPr>
-              <w:spacing w:after="80"/>
-            </w:pPr>
-            <w:r>
-              <w:rPr>
-                <w:i/>
-                <w:iCs/>
-                <w:color w:val="595959"/>
-                <w:sz w:val="18"/>
-                <w:szCs w:val="18"/>
-              </w:rPr>
-              <w:t xml:space="preserve">e.g. fixed vs semantic; size/overlap</w:t>
+            <w:r/>
+            <w:r>
+              <w:t>Fixed-size token windows; paragraph splitting; semantic/embedding-based chunking; region-aware chunking.</w:t>
             </w:r>
           </w:p>
         </w:tc>
@@ -1230,11 +1160,9 @@
             <w:tcW w:type="dxa" w:w="3200"/>
           </w:tcPr>
           <w:p>
-            <w:pPr>
-              <w:spacing w:after="80"/>
-            </w:pPr>
-            <w:r>
-              <w:t xml:space="preserve"/>
+            <w:r/>
+            <w:r>
+              <w:t>Region-aware chunks, split on Nougat's Markdown headings, 256 tokens with 32 overlap. A chunk never spans two layout regions. Fixed windows over a flattened page would re-mix the columns Stage 2 just separated and glue table cells onto neighbouring prose, undoing the reading order we paid for. Because Nougat emits headings, section boundaries are free and are strictly better cut points than a blind window.</w:t>
             </w:r>
           </w:p>
         </w:tc>
@@ -1243,11 +1171,9 @@
             <w:tcW w:type="dxa" w:w="1560"/>
           </w:tcPr>
           <w:p>
-            <w:pPr>
-              <w:spacing w:after="80"/>
-            </w:pPr>
-            <w:r>
-              <w:t xml:space="preserve"/>
+            <w:r/>
+            <w:r>
+              <w:t>no</w:t>
             </w:r>
           </w:p>
         </w:tc>
@@ -1271,18 +1197,9 @@
             <w:tcW w:type="dxa" w:w="2900"/>
           </w:tcPr>
           <w:p>
-            <w:pPr>
-              <w:spacing w:after="80"/>
-            </w:pPr>
-            <w:r>
-              <w:rPr>
-                <w:i/>
-                <w:iCs/>
-                <w:color w:val="595959"/>
-                <w:sz w:val="18"/>
-                <w:szCs w:val="18"/>
-              </w:rPr>
-              <w:t xml:space="preserve">e.g. which sentence-embedding model</w:t>
+            <w:r/>
+            <w:r>
+              <w:t>all-MiniLM-L6-v2 (384-d), BAAI/bge-base-en-v1.5 (768-d), BAAI/bge-large-en-v1.5 (1024-d), E5.</w:t>
             </w:r>
           </w:p>
         </w:tc>
@@ -1291,11 +1208,9 @@
             <w:tcW w:type="dxa" w:w="3200"/>
           </w:tcPr>
           <w:p>
-            <w:pPr>
-              <w:spacing w:after="80"/>
-            </w:pPr>
-            <w:r>
-              <w:t xml:space="preserve"/>
+            <w:r/>
+            <w:r>
+              <w:t>BAAI/bge-base-en-v1.5, 768-d, normalised, with the query-side instruction prefix the model was trained with. Our corpus is English scientific prose, which bge handles well. A1 named bge-large; base is the documented trade - 4x smaller, so the built index ships inside the repo and the demo notebook runs for a grader with no GPU. MiniLM at 384-d would have cost retrieval quality on technical vocabulary for a saving we did not need.</w:t>
             </w:r>
           </w:p>
         </w:tc>
@@ -1304,11 +1219,9 @@
             <w:tcW w:type="dxa" w:w="1560"/>
           </w:tcPr>
           <w:p>
-            <w:pPr>
-              <w:spacing w:after="80"/>
-            </w:pPr>
-            <w:r>
-              <w:t xml:space="preserve"/>
+            <w:r/>
+            <w:r>
+              <w:t>no</w:t>
             </w:r>
           </w:p>
         </w:tc>
@@ -1332,18 +1245,9 @@
             <w:tcW w:type="dxa" w:w="2900"/>
           </w:tcPr>
           <w:p>
-            <w:pPr>
-              <w:spacing w:after="80"/>
-            </w:pPr>
-            <w:r>
-              <w:rPr>
-                <w:i/>
-                <w:iCs/>
-                <w:color w:val="595959"/>
-                <w:sz w:val="18"/>
-                <w:szCs w:val="18"/>
-              </w:rPr>
-              <w:t xml:space="preserve">e.g. flat vs HNSW vs IVF/PQ</w:t>
+            <w:r/>
+            <w:r>
+              <w:t>FAISS IndexFlatIP (exact), HNSW, IVF-PQ.</w:t>
             </w:r>
           </w:p>
         </w:tc>
@@ -1352,11 +1256,9 @@
             <w:tcW w:type="dxa" w:w="3200"/>
           </w:tcPr>
           <w:p>
-            <w:pPr>
-              <w:spacing w:after="80"/>
-            </w:pPr>
-            <w:r>
-              <w:t xml:space="preserve"/>
+            <w:r/>
+            <w:r>
+              <w:t>IndexFlatIP - exact inner product over normalised vectors. At this corpus size an approximate index trades recall for a speedup we do not need, and recall is precisely what our robustness NFR is about: an ANN miss on a figure-evidence page is indistinguishable from a reading failure and would corrupt the very gap we commit to. Flat search is O(n) and would not survive two more orders of magnitude, which is the condition that would flip us to HNSW.</w:t>
             </w:r>
           </w:p>
         </w:tc>
@@ -1365,11 +1267,9 @@
             <w:tcW w:type="dxa" w:w="1560"/>
           </w:tcPr>
           <w:p>
-            <w:pPr>
-              <w:spacing w:after="80"/>
-            </w:pPr>
-            <w:r>
-              <w:t xml:space="preserve"/>
+            <w:r/>
+            <w:r>
+              <w:t>no</w:t>
             </w:r>
           </w:p>
         </w:tc>
@@ -2226,11 +2126,9 @@
             <w:tcW w:type="dxa" w:w="5860"/>
           </w:tcPr>
           <w:p>
-            <w:pPr>
-              <w:spacing w:after="80"/>
-            </w:pPr>
-            <w:r>
-              <w:t xml:space="preserve"/>
+            <w:r/>
+            <w:r>
+              <w:t>Retrieval is already minimally in place (dense top-k with scores). A3 adds, in build order: (1) the bge cross-encoder reranker - gated for us, because our biggest observed retrieval failure is topically-similar prose outranking the figure region that actually holds the number; (2) the LLM client and prompt registry; (3) the nine fixed tools; (4) the agent loop's decide/act/synthesize, carrying the MANDATORY evidence-gated re-search - if top_score &lt; weak_threshold, widen k by k_step and retrieve again, abstaining once k would exceed k_max. The knobs (k=10, k_step=10, k_max=40, weak_threshold=0.35) and the helpers is_weak()/next_k()/top_score() are already in configs/config.yaml and retrieval/retriever.py; (5) the grounding gate wired to BEFORE_ANSWER so an answer with no traceable page and bbox abstains; (6) tracing to traces/run.jsonl; (7) eval/metrics.py for per-stratum answer-F1, and the ablation. RL/RLVR only if time allows.</w:t>
             </w:r>
           </w:p>
         </w:tc>
@@ -2274,11 +2172,9 @@
             <w:tcW w:type="dxa" w:w="5860"/>
           </w:tcPr>
           <w:p>
-            <w:pPr>
-              <w:spacing w:after="80"/>
-            </w:pPr>
-            <w:r>
-              <w:t xml:space="preserve"/>
+            <w:r/>
+            <w:r>
+              <w:t>tasks.jsonl is authored from SciEGQA-Bench's own annotations, so every item is checkable against a known evidence page and bounding box rather than our opinion. We stratify by S1/S2/S3 and record each task's expected stratum, so the robustness gap is measured directly rather than inferred. Verifiable short-span and numeric answers dominate, so grading stays objective. Abstention cases are included deliberately: questions whose evidence page we hold out of the index, where the correct behaviour is silence. We also include the required needs_research:true/false pair - a control item answerable from the top chunk, and a trigger item whose answer is not on the top chunk so the agent must widen k for the A3 agentic gate to see re-search fire.</w:t>
             </w:r>
           </w:p>
         </w:tc>
@@ -2322,11 +2218,9 @@
             <w:tcW w:type="dxa" w:w="5860"/>
           </w:tcPr>
           <w:p>
-            <w:pPr>
-              <w:spacing w:after="80"/>
-            </w:pPr>
-            <w:r>
-              <w:t xml:space="preserve"/>
+            <w:r/>
+            <w:r>
+              <w:t>The biggest risk is memorisation, and it is specific to our corpus: these are real arXiv papers, so the answering model has very likely seen them in pretraining and can produce a plausible number from parametric memory without reading the page at all - which looks like success and is not. Our first move is the memorisation probe: re-run a sample with the page image withheld and treat anything still answered correctly as a warning, not a win. The second risk is more ordinary: our retrieval misses concentrate on figure-evidence questions, where a question about what a figure SHOWS shares little surface vocabulary with the caption that represents it. The reranker is the first fix; if it is not enough, the answer is to index a short VLM-written description of each figure region alongside its transcription.</w:t>
             </w:r>
           </w:p>
         </w:tc>
@@ -2467,18 +2361,9 @@
             <w:tcW w:type="dxa" w:w="3400"/>
           </w:tcPr>
           <w:p>
-            <w:pPr>
-              <w:spacing w:after="80"/>
-            </w:pPr>
-            <w:r>
-              <w:rPr>
-                <w:i/>
-                <w:iCs/>
-                <w:color w:val="595959"/>
-                <w:sz w:val="18"/>
-                <w:szCs w:val="18"/>
-              </w:rPr>
-              <w:t xml:space="preserve">what these stages must achieve + success metric</w:t>
+            <w:r/>
+            <w:r>
+              <w:t>Turn 1,823 scanned pages into searchable text without losing which box on which page each piece came from. Success: the knowledge base supports the A1 metric (pooled answer-F1 &gt;= 0.70) and the robustness gate F1(S1)-F1(S3) &lt;= 8, both judged in A3; at A2 the proxy is measured OCR quality per stratum and evidence-page recall.</w:t>
             </w:r>
           </w:p>
         </w:tc>
@@ -2487,18 +2372,9 @@
             <w:tcW w:type="dxa" w:w="3760"/>
           </w:tcPr>
           <w:p>
-            <w:pPr>
-              <w:spacing w:after="80"/>
-            </w:pPr>
-            <w:r>
-              <w:rPr>
-                <w:i/>
-                <w:iCs/>
-                <w:color w:val="595959"/>
-                <w:sz w:val="18"/>
-                <w:szCs w:val="18"/>
-              </w:rPr>
-              <w:t xml:space="preserve">why this · its cost · what would change our mind</w:t>
+            <w:r/>
+            <w:r>
+              <w:t>These stages cannot themselves answer questions, so their success has to be stated as what they make possible. Cost: the per-stratum framing means we cannot report a flattering average. What would change our mind: if OCR quality were uniform across strata, a pooled number would be honest and simpler.</w:t>
             </w:r>
           </w:p>
         </w:tc>
@@ -2522,18 +2398,9 @@
             <w:tcW w:type="dxa" w:w="3400"/>
           </w:tcPr>
           <w:p>
-            <w:pPr>
-              <w:spacing w:after="80"/>
-            </w:pPr>
-            <w:r>
-              <w:rPr>
-                <w:i/>
-                <w:iCs/>
-                <w:color w:val="595959"/>
-                <w:sz w:val="18"/>
-                <w:szCs w:val="18"/>
-              </w:rPr>
-              <w:t xml:space="preserve">inputs, formats, splits, any labels used</w:t>
+            <w:r/>
+            <w:r>
+              <w:t>SciEGQA-Bench at pinned revision 9bdca77b: 80 arXiv PDFs -&gt; 1,823 pages rendered at 300 DPI greyscale, 788,265 words. Labels used: the corpus's own rel_bbox + subimg_type as region annotations, and an 18-page hand-checked transcription oracle. Split 70/15/15 BY DOCUMENT (56/16/8 docs), stratified by category, seed 42.</w:t>
             </w:r>
           </w:p>
         </w:tc>
@@ -2542,18 +2409,9 @@
             <w:tcW w:type="dxa" w:w="3760"/>
           </w:tcPr>
           <w:p>
-            <w:pPr>
-              <w:spacing w:after="80"/>
-            </w:pPr>
-            <w:r>
-              <w:rPr>
-                <w:i/>
-                <w:iCs/>
-                <w:color w:val="595959"/>
-                <w:sz w:val="18"/>
-                <w:szCs w:val="18"/>
-              </w:rPr>
-              <w:t xml:space="preserve">why this · its cost · what would change our mind</w:t>
+            <w:r/>
+            <w:r>
+              <w:t>The Bench split is the only one whose evidence is typed text/table/image - all 30,780 Train rows are labelled 'image' - so our S1/S2/S3 strata, and therefore our NFR, can only be built here. Cost: 1,823 pages rather than the 51.8k A1 estimated, which we disclose as indexed-vs-total. Splitting by document makes the leak A1 named structurally impossible; validate.py asserts it. What would change our mind: a corpus with typed evidence at larger scale.</w:t>
             </w:r>
           </w:p>
         </w:tc>
@@ -2577,18 +2435,9 @@
             <w:tcW w:type="dxa" w:w="3400"/>
           </w:tcPr>
           <w:p>
-            <w:pPr>
-              <w:spacing w:after="80"/>
-            </w:pPr>
-            <w:r>
-              <w:rPr>
-                <w:i/>
-                <w:iCs/>
-                <w:color w:val="595959"/>
-                <w:sz w:val="18"/>
-                <w:szCs w:val="18"/>
-              </w:rPr>
-              <w:t xml:space="preserve">checkpoints chosen per stage</w:t>
+            <w:r/>
+            <w:r>
+              <w:t>Stage 1 none (deterministic ops). Stage 2 none learned (projection + morphology) over the corpus's own boxes. Stage 3 facebook/nougat-base, pretrained. Stage 4 BAAI/bge-base-en-v1.5, pretrained.</w:t>
             </w:r>
           </w:p>
         </w:tc>
@@ -2597,18 +2446,9 @@
             <w:tcW w:type="dxa" w:w="3760"/>
           </w:tcPr>
           <w:p>
-            <w:pPr>
-              <w:spacing w:after="80"/>
-            </w:pPr>
-            <w:r>
-              <w:rPr>
-                <w:i/>
-                <w:iCs/>
-                <w:color w:val="595959"/>
-                <w:sz w:val="18"/>
-                <w:szCs w:val="18"/>
-              </w:rPr>
-              <w:t xml:space="preserve">why this · its cost · what would change our mind</w:t>
+            <w:r/>
+            <w:r>
+              <w:t>One reproduced published method (Nougat) where it matters most, and no learned model where a deterministic one is provably sufficient. Cost: Nougat is a generative decoder, so it is slow and can fall into repetition loops on dense tables - we guard and count that rather than hide it. We do not fine-tune: with no transcription labels beyond the 18-page oracle we score against, fine-tuning would overfit the oracle. What would change our mind: a separate labelled training split.</w:t>
             </w:r>
           </w:p>
         </w:tc>
@@ -2632,18 +2472,9 @@
             <w:tcW w:type="dxa" w:w="3400"/>
           </w:tcPr>
           <w:p>
-            <w:pPr>
-              <w:spacing w:after="80"/>
-            </w:pPr>
-            <w:r>
-              <w:rPr>
-                <w:i/>
-                <w:iCs/>
-                <w:color w:val="595959"/>
-                <w:sz w:val="18"/>
-                <w:szCs w:val="18"/>
-              </w:rPr>
-              <w:t xml:space="preserve">fine-tuning / inference technique, key hyperparameters</w:t>
+            <w:r/>
+            <w:r>
+              <w:t>Render 300 DPI at native page size; NFKC + maths punctuation normalisation; no deskew/denoise/binarize. Layout: gutter via banded projection, blocks via morphological closing, reading order = band, then column, then y. OCR: full-page pass for prose, separate pass per figure/table crop with 8px padding, fp16, max_new_tokens 3584, batch auto-sized to VRAM. Index: 256-token chunks / 32 overlap, region-aware, normalised embeddings.</w:t>
             </w:r>
           </w:p>
         </w:tc>
@@ -2652,18 +2483,9 @@
             <w:tcW w:type="dxa" w:w="3760"/>
           </w:tcPr>
           <w:p>
-            <w:pPr>
-              <w:spacing w:after="80"/>
-            </w:pPr>
-            <w:r>
-              <w:rPr>
-                <w:i/>
-                <w:iCs/>
-                <w:color w:val="595959"/>
-                <w:sz w:val="18"/>
-                <w:szCs w:val="18"/>
-              </w:rPr>
-              <w:t xml:space="preserve">why this · its cost · what would change our mind</w:t>
+            <w:r/>
+            <w:r>
+              <w:t>Every parameter is set by a property of this corpus. 300 DPI because that is the frame the annotations were authored in - verified: bbox == rel_bbox/1000 x page_pixels. 8px crop padding because tight boxes clip subscripts. Two OCR paths because 56.1% of evidence is inside a region. Cost: one model call per page plus one per region. What would change our mind: illegible small-font crops would push us to 600 DPI for crops only.</w:t>
             </w:r>
           </w:p>
         </w:tc>
@@ -2687,18 +2509,9 @@
             <w:tcW w:type="dxa" w:w="3400"/>
           </w:tcPr>
           <w:p>
-            <w:pPr>
-              <w:spacing w:after="80"/>
-            </w:pPr>
-            <w:r>
-              <w:rPr>
-                <w:i/>
-                <w:iCs/>
-                <w:color w:val="595959"/>
-                <w:sz w:val="18"/>
-                <w:szCs w:val="18"/>
-              </w:rPr>
-              <w:t xml:space="preserve">how the stages connect (the data contracts)</w:t>
+            <w:r/>
+            <w:r>
+              <w:t>A fixed stage order (pipeline.py) with typed contracts on every boundary: Page -&gt; list[Region] in reading order -&gt; list[Chunk] -&gt; vectors -&gt; FAISS + chunks.jsonl. Region order IS the contract Stage 3 consumes. PII redaction is wired at the AFTER_OCR seam, between reading and indexing.</w:t>
             </w:r>
           </w:p>
         </w:tc>
@@ -2707,18 +2520,9 @@
             <w:tcW w:type="dxa" w:w="3760"/>
           </w:tcPr>
           <w:p>
-            <w:pPr>
-              <w:spacing w:after="80"/>
-            </w:pPr>
-            <w:r>
-              <w:rPr>
-                <w:i/>
-                <w:iCs/>
-                <w:color w:val="595959"/>
-                <w:sz w:val="18"/>
-                <w:szCs w:val="18"/>
-              </w:rPr>
-              <w:t xml:space="preserve">why this · its cost · what would change our mind</w:t>
+            <w:r/>
+            <w:r>
+              <w:t>The contracts are locked and cannot gain fields, so per-page and per-region metadata lives in sidecars (PAGE_META, REGION_META) keyed by id rather than in the types. Cost: two lookup tables to keep in sync with the objects. PII sits at AFTER_OCR because that is the last point where text exists but is not yet searchable. What would change our mind: needing region provenance inside Chunk, which the fixed contract forbids - we encode it in chunk.id instead.</w:t>
             </w:r>
           </w:p>
         </w:tc>
@@ -2742,18 +2546,9 @@
             <w:tcW w:type="dxa" w:w="3400"/>
           </w:tcPr>
           <w:p>
-            <w:pPr>
-              <w:spacing w:after="80"/>
-            </w:pPr>
-            <w:r>
-              <w:rPr>
-                <w:i/>
-                <w:iCs/>
-                <w:color w:val="595959"/>
-                <w:sz w:val="18"/>
-                <w:szCs w:val="18"/>
-              </w:rPr>
-              <w:t xml:space="preserve">tests, config, experiment logging</w:t>
+            <w:r/>
+            <w:r>
+              <w:t>Assertions where silent failure is possible: page geometry vs manifest, embed.dim vs the model's real output, corpus floors and zero split leakage before any model runs. All tunables in configs/config.yaml only. Structured JSON logging, never print. OCR results cached per page so a run resumes. Structure lock + contracts + tools tests green; ruff, black and mypy clean on the modules we wrote.</w:t>
             </w:r>
           </w:p>
         </w:tc>
@@ -2762,18 +2557,9 @@
             <w:tcW w:type="dxa" w:w="3760"/>
           </w:tcPr>
           <w:p>
-            <w:pPr>
-              <w:spacing w:after="80"/>
-            </w:pPr>
-            <w:r>
-              <w:rPr>
-                <w:i/>
-                <w:iCs/>
-                <w:color w:val="595959"/>
-                <w:sz w:val="18"/>
-                <w:szCs w:val="18"/>
-              </w:rPr>
-              <w:t xml:space="preserve">why this · its cost · what would change our mind</w:t>
+            <w:r/>
+            <w:r>
+              <w:t>The tests target the failures that would otherwise surface much later as unexplained OCR errors - the geometry assertion already caught a one-pixel truncation bug in our own manifest on A4 pages. Cost: a build that stops on conditions a laxer pipeline would ignore. What would change our mind: adding a learned stage, which would need seed control and metric logging well beyond assertions.</w:t>
             </w:r>
           </w:p>
         </w:tc>
@@ -2797,18 +2583,9 @@
             <w:tcW w:type="dxa" w:w="3400"/>
           </w:tcPr>
           <w:p>
-            <w:pPr>
-              <w:spacing w:after="80"/>
-            </w:pPr>
-            <w:r>
-              <w:rPr>
-                <w:i/>
-                <w:iCs/>
-                <w:color w:val="595959"/>
-                <w:sz w:val="18"/>
-                <w:szCs w:val="18"/>
-              </w:rPr>
-              <w:t xml:space="preserve">how indexing runs (batch, device, memory)</w:t>
+            <w:r/>
+            <w:r>
+              <w:t>Offline batch, run once per corpus revision, results cached to disk. GPU for OCR and embedding (batch auto-sized from VRAM, with an out-of-memory fallback to one page at a time); CPU is sufficient for everything else. The built index is committed to the repository.</w:t>
             </w:r>
           </w:p>
         </w:tc>
@@ -2817,18 +2594,9 @@
             <w:tcW w:type="dxa" w:w="3760"/>
           </w:tcPr>
           <w:p>
-            <w:pPr>
-              <w:spacing w:after="80"/>
-            </w:pPr>
-            <w:r>
-              <w:rPr>
-                <w:i/>
-                <w:iCs/>
-                <w:color w:val="595959"/>
-                <w:sz w:val="18"/>
-                <w:szCs w:val="18"/>
-              </w:rPr>
-              <w:t xml:space="preserve">why this · its cost · what would change our mind</w:t>
+            <w:r/>
+            <w:r>
+              <w:t>The corpus is static, so paying ingest cost at query time buys nothing. Batching is the knob that decides whether the corpus takes 20 minutes or three hours, so it is auto-sized rather than hard-coded to one machine. The index ships in the repo specifically so kb_demo.ipynb runs for a grader with no GPU. Cost: build time and ~tens of MB in git. What would change our mind: user-uploaded PDFs, which turn this into online ingest.</w:t>
             </w:r>
           </w:p>
         </w:tc>
@@ -2852,18 +2620,9 @@
             <w:tcW w:type="dxa" w:w="3400"/>
           </w:tcPr>
           <w:p>
-            <w:pPr>
-              <w:spacing w:after="80"/>
-            </w:pPr>
-            <w:r>
-              <w:rPr>
-                <w:i/>
-                <w:iCs/>
-                <w:color w:val="595959"/>
-                <w:sz w:val="18"/>
-                <w:szCs w:val="18"/>
-              </w:rPr>
-              <w:t xml:space="preserve">corpus versioning, what you'd monitor</w:t>
+            <w:r/>
+            <w:r>
+              <w:t>Corpus pinned to an exact HF revision; corpus_version = hash of manifest+qa+splits; every index tagged with its embedding model, chunk parameters and corpus counts in index_meta.json. Monitoring, once serving: out-of-bounds crops and empty transcriptions as build regressions, and retrieval score distribution drift.</w:t>
             </w:r>
           </w:p>
         </w:tc>
@@ -2872,18 +2631,9 @@
             <w:tcW w:type="dxa" w:w="3760"/>
           </w:tcPr>
           <w:p>
-            <w:pPr>
-              <w:spacing w:after="80"/>
-            </w:pPr>
-            <w:r>
-              <w:rPr>
-                <w:i/>
-                <w:iCs/>
-                <w:color w:val="595959"/>
-                <w:sz w:val="18"/>
-                <w:szCs w:val="18"/>
-              </w:rPr>
-              <w:t xml:space="preserve">why this · its cost · what would change our mind</w:t>
+            <w:r/>
+            <w:r>
+              <w:t>Reproducibility is the whole point when the corpus is itself the ground truth, so pinning and tagging matter more than live metrics for a static batch. We hash the manifest rather than 0.58 GB of PNGs because the manifest already names every page, its size and its split. Cost: discipline around revisions. What would change our mind: a live document source, which turns the rebuild trigger into streaming ingest needing real drift monitoring.</w:t>
             </w:r>
           </w:p>
         </w:tc>

</xml_diff>

<commit_message>
A2: filled form sections 4-5, executed kb_demo, measured design record
</commit_message>
<xml_diff>
--- a/forms/A2_form.docx
+++ b/forms/A2_form.docx
@@ -1424,11 +1424,9 @@
             <w:tcW w:type="dxa" w:w="2700"/>
           </w:tcPr>
           <w:p>
-            <w:pPr>
-              <w:spacing w:after="80"/>
-            </w:pPr>
-            <w:r>
-              <w:t xml:space="preserve"/>
+            <w:r/>
+            <w:r>
+              <w:t>none (deterministic PyMuPDF + Pillow)</w:t>
             </w:r>
           </w:p>
         </w:tc>
@@ -1437,11 +1435,9 @@
             <w:tcW w:type="dxa" w:w="2400"/>
           </w:tcPr>
           <w:p>
-            <w:pPr>
-              <w:spacing w:after="80"/>
-            </w:pPr>
-            <w:r>
-              <w:t xml:space="preserve"/>
+            <w:r/>
+            <w:r>
+              <w:t>300 DPI, native page size, 8-bit greyscale, NFKC + maths punctuation, 8px crop padding; enhance.enabled=false</w:t>
             </w:r>
           </w:p>
         </w:tc>
@@ -1450,11 +1446,9 @@
             <w:tcW w:type="dxa" w:w="2360"/>
           </w:tcPr>
           <w:p>
-            <w:pPr>
-              <w:spacing w:after="80"/>
-            </w:pPr>
-            <w:r>
-              <w:t xml:space="preserve"/>
+            <w:r/>
+            <w:r>
+              <w:t>n/a - no model</w:t>
             </w:r>
           </w:p>
         </w:tc>
@@ -1478,11 +1472,9 @@
             <w:tcW w:type="dxa" w:w="2700"/>
           </w:tcPr>
           <w:p>
-            <w:pPr>
-              <w:spacing w:after="80"/>
-            </w:pPr>
-            <w:r>
-              <w:t xml:space="preserve"/>
+            <w:r/>
+            <w:r>
+              <w:t>no learned model; corpus rel_bbox + subimg_type annotations</w:t>
             </w:r>
           </w:p>
         </w:tc>
@@ -1491,11 +1483,9 @@
             <w:tcW w:type="dxa" w:w="2400"/>
           </w:tcPr>
           <w:p>
-            <w:pPr>
-              <w:spacing w:after="80"/>
-            </w:pPr>
-            <w:r>
-              <w:t xml:space="preserve"/>
+            <w:r/>
+            <w:r>
+              <w:t>gutter search in middle 30-70% of width, min width 1.2%, persistence &gt;= 50% of text bands; block close kernels (15x3) then (9x21) at 850px working width</w:t>
             </w:r>
           </w:p>
         </w:tc>
@@ -1504,11 +1494,9 @@
             <w:tcW w:type="dxa" w:w="2360"/>
           </w:tcPr>
           <w:p>
-            <w:pPr>
-              <w:spacing w:after="80"/>
-            </w:pPr>
-            <w:r>
-              <w:t xml:space="preserve"/>
+            <w:r/>
+            <w:r>
+              <w:t>n/a - deterministic</w:t>
             </w:r>
           </w:p>
         </w:tc>
@@ -1532,11 +1520,9 @@
             <w:tcW w:type="dxa" w:w="2700"/>
           </w:tcPr>
           <w:p>
-            <w:pPr>
-              <w:spacing w:after="80"/>
-            </w:pPr>
-            <w:r>
-              <w:t xml:space="preserve"/>
+            <w:r/>
+            <w:r>
+              <w:t>facebook/nougat-base (Blecher et al. 2023)</w:t>
             </w:r>
           </w:p>
         </w:tc>
@@ -1545,11 +1531,9 @@
             <w:tcW w:type="dxa" w:w="2400"/>
           </w:tcPr>
           <w:p>
-            <w:pPr>
-              <w:spacing w:after="80"/>
-            </w:pPr>
-            <w:r>
-              <w:t xml:space="preserve"/>
+            <w:r/>
+            <w:r>
+              <w:t>fp16, max_new_tokens 3584, batch_size 2 (auto-sized from Kaggle Tesla T4, 15 GB), repetition guard on, per-page resume cache</w:t>
             </w:r>
           </w:p>
         </w:tc>
@@ -1558,11 +1542,9 @@
             <w:tcW w:type="dxa" w:w="2360"/>
           </w:tcPr>
           <w:p>
-            <w:pPr>
-              <w:spacing w:after="80"/>
-            </w:pPr>
-            <w:r>
-              <w:t xml:space="preserve"/>
+            <w:r/>
+            <w:r>
+              <w:t>pretrained</w:t>
             </w:r>
           </w:p>
         </w:tc>
@@ -1586,11 +1568,9 @@
             <w:tcW w:type="dxa" w:w="2700"/>
           </w:tcPr>
           <w:p>
-            <w:pPr>
-              <w:spacing w:after="80"/>
-            </w:pPr>
-            <w:r>
-              <w:t xml:space="preserve"/>
+            <w:r/>
+            <w:r>
+              <w:t>no model (rule-based, region-aware)</w:t>
             </w:r>
           </w:p>
         </w:tc>
@@ -1599,11 +1579,9 @@
             <w:tcW w:type="dxa" w:w="2400"/>
           </w:tcPr>
           <w:p>
-            <w:pPr>
-              <w:spacing w:after="80"/>
-            </w:pPr>
-            <w:r>
-              <w:t xml:space="preserve"/>
+            <w:r/>
+            <w:r>
+              <w:t>256 tokens, 32 overlap, split on Markdown headings, never spans a region</w:t>
             </w:r>
           </w:p>
         </w:tc>
@@ -1612,11 +1590,9 @@
             <w:tcW w:type="dxa" w:w="2360"/>
           </w:tcPr>
           <w:p>
-            <w:pPr>
-              <w:spacing w:after="80"/>
-            </w:pPr>
-            <w:r>
-              <w:t xml:space="preserve"/>
+            <w:r/>
+            <w:r>
+              <w:t>n/a - deterministic</w:t>
             </w:r>
           </w:p>
         </w:tc>
@@ -1640,11 +1616,9 @@
             <w:tcW w:type="dxa" w:w="2700"/>
           </w:tcPr>
           <w:p>
-            <w:pPr>
-              <w:spacing w:after="80"/>
-            </w:pPr>
-            <w:r>
-              <w:t xml:space="preserve"/>
+            <w:r/>
+            <w:r>
+              <w:t>BAAI/bge-base-en-v1.5</w:t>
             </w:r>
           </w:p>
         </w:tc>
@@ -1653,11 +1627,9 @@
             <w:tcW w:type="dxa" w:w="2400"/>
           </w:tcPr>
           <w:p>
-            <w:pPr>
-              <w:spacing w:after="80"/>
-            </w:pPr>
-            <w:r>
-              <w:t xml:space="preserve"/>
+            <w:r/>
+            <w:r>
+              <w:t>768-d, normalised, batch 64, query-side instruction prefix</w:t>
             </w:r>
           </w:p>
         </w:tc>
@@ -1666,11 +1638,9 @@
             <w:tcW w:type="dxa" w:w="2360"/>
           </w:tcPr>
           <w:p>
-            <w:pPr>
-              <w:spacing w:after="80"/>
-            </w:pPr>
-            <w:r>
-              <w:t xml:space="preserve"/>
+            <w:r/>
+            <w:r>
+              <w:t>pretrained</w:t>
             </w:r>
           </w:p>
         </w:tc>
@@ -1694,11 +1664,9 @@
             <w:tcW w:type="dxa" w:w="2700"/>
           </w:tcPr>
           <w:p>
-            <w:pPr>
-              <w:spacing w:after="80"/>
-            </w:pPr>
-            <w:r>
-              <w:t xml:space="preserve"/>
+            <w:r/>
+            <w:r>
+              <w:t>FAISS IndexFlatIP</w:t>
             </w:r>
           </w:p>
         </w:tc>
@@ -1707,11 +1675,9 @@
             <w:tcW w:type="dxa" w:w="2400"/>
           </w:tcPr>
           <w:p>
-            <w:pPr>
-              <w:spacing w:after="80"/>
-            </w:pPr>
-            <w:r>
-              <w:t xml:space="preserve"/>
+            <w:r/>
+            <w:r>
+              <w:t>exact inner product, 5,240 vectors x 768-d, 15.4 MB on disk</w:t>
             </w:r>
           </w:p>
         </w:tc>
@@ -1720,11 +1686,9 @@
             <w:tcW w:type="dxa" w:w="2360"/>
           </w:tcPr>
           <w:p>
-            <w:pPr>
-              <w:spacing w:after="80"/>
-            </w:pPr>
-            <w:r>
-              <w:t xml:space="preserve"/>
+            <w:r/>
+            <w:r>
+              <w:t>n/a - not a learned model</w:t>
             </w:r>
           </w:p>
         </w:tc>
@@ -1785,11 +1749,9 @@
             <w:tcW w:type="dxa" w:w="5860"/>
           </w:tcPr>
           <w:p>
-            <w:pPr>
-              <w:spacing w:after="80"/>
-            </w:pPr>
-            <w:r>
-              <w:t xml:space="preserve"/>
+            <w:r/>
+            <w:r>
+              <w:t>pages -&gt; render 300 DPI -&gt; verify (no enhance) -&gt; layout: gutter, bands, reading order -&gt; OCR: Nougat full page + one pass per figure/table crop -&gt; PII redaction -&gt; region-aware chunk -&gt; bge-base embed -&gt; FAISS flat. Changed from the default: enhancement is OFF (born-digital renders), layout returns regions IN READING ORDER rather than an unordered set, OCR runs twice per page when a figure or table is present, and the index is flat rather than HNSW. Built in 268 minutes on Kaggle Tesla T4, 15 GB.</w:t>
             </w:r>
           </w:p>
         </w:tc>
@@ -1881,11 +1843,14 @@
             <w:tcW w:type="dxa" w:w="5860"/>
           </w:tcPr>
           <w:p>
-            <w:pPr>
-              <w:spacing w:after="80"/>
-            </w:pPr>
-            <w:r>
-              <w:t xml:space="preserve"/>
+            <w:r/>
+            <w:r>
+              <w:t>Character error rate 0.300 (character accuracy 0.700) and token-level F1 0.866 on 18 held-out pages drawn only from test-split documents.</w:t>
+            </w:r>
+          </w:p>
+          <w:p>
+            <w:r>
+              <w:t>Per stratum, token-F1: S1 0.763 / S2 0.892 / S3 0.943 (6 pages each). Ground truth is the PDF text layer extracted in column-aware reading order with figure internals removed, because Nougat emits a figure's caption and not its internals; the full-page comparison is reported alongside it in the notebook. Reproduced in notebooks/kb_demo.ipynb section 2.</w:t>
             </w:r>
           </w:p>
         </w:tc>
@@ -1929,11 +1894,24 @@
             <w:tcW w:type="dxa" w:w="5860"/>
           </w:tcPr>
           <w:p>
-            <w:pPr>
-              <w:spacing w:after="80"/>
-            </w:pPr>
-            <w:r>
-              <w:t xml:space="preserve"/>
+            <w:r/>
+            <w:r>
+              <w:t>5,240 chunks indexed, of which 644 are figure or table transcriptions. Embedding dimension 768 (BAAI/bge-base-en-v1.5). Index type FAISS IndexFlatIP (exact), 15.4 MB on disk, chunked at 256 tokens with 32 overlap.</w:t>
+            </w:r>
+          </w:p>
+          <w:p>
+            <w:r>
+              <w:t>Corpus coverage: 1,818 of 1,823 pages (99.7%) across all 80 documents. The chunks hold 817,614 words against a 788,265-word PDF text layer; that it EXCEEDS the corpus count is expected, not an error - chunks carry 32 tokens of overlap, figure and table regions are transcribed a second time as their own chunks, and the reader emits LaTeX the text layer does not contain.</w:t>
+            </w:r>
+          </w:p>
+          <w:p>
+            <w:r>
+              <w:t>The 5 missing pages were removed by the PII gate at hooks.AFTER_OCR: 4 title pages and 1 bibliography page, each dominated by author names, affiliations and emails. That is the governance rule we committed to in A1 working as specified; the measurable cost is that those 4 papers' titles are not directly retrievable.</w:t>
+            </w:r>
+          </w:p>
+          <w:p>
+            <w:r>
+              <w:t>The wider SciEGQA corpus is larger; we index the Bench split because it is the only one with typed evidence regions, which our strata require.</w:t>
             </w:r>
           </w:p>
         </w:tc>
@@ -1977,11 +1955,29 @@
             <w:tcW w:type="dxa" w:w="5860"/>
           </w:tcPr>
           <w:p>
-            <w:pPr>
-              <w:spacing w:after="80"/>
-            </w:pPr>
-            <w:r>
-              <w:t xml:space="preserve"/>
+            <w:r/>
+            <w:r>
+              <w:t>Query: In the reduced confusion matrix, which two grey probability terms appear in the Y-hat=1 column, and what sigma is given for XT in the mortgage example legend?</w:t>
+            </w:r>
+          </w:p>
+          <w:p>
+            <w:r>
+              <w:t>Top chunk returned: econ/2405.09360/p006#r01:figure/c000 (similarity 0.7071).</w:t>
+            </w:r>
+          </w:p>
+          <w:p>
+            <w:r>
+              <w:t>Gold evidence page: econ/2405.09360/p006 (and p008) - the retrieved chunk is on that page, so yes, the right page.</w:t>
+            </w:r>
+          </w:p>
+          <w:p>
+            <w:r>
+              <w:t>Chunk text: [figure] Figure 3: Confusion matrix in the reduced setting. The cases 00 and 10 are now collapsed to the case (0) (where Y-hat=0).</w:t>
+            </w:r>
+          </w:p>
+          <w:p>
+            <w:r>
+              <w:t>Measured over 150 sampled queries scored against the corpus's own gold evidence pages: recall@1 0.353, recall@5 0.600, recall@10 0.667. Per stratum at k=5: S1 0.528 / S2 0.706 / S3 0.625.</w:t>
             </w:r>
           </w:p>
         </w:tc>
@@ -2025,11 +2021,14 @@
             <w:tcW w:type="dxa" w:w="5860"/>
           </w:tcPr>
           <w:p>
-            <w:pPr>
-              <w:spacing w:after="80"/>
-            </w:pPr>
-            <w:r>
-              <w:t xml:space="preserve"/>
+            <w:r/>
+            <w:r>
+              <w:t>Two, both honest. Reading: math/2412.17167/p002 was transcribed at CER 0.902 against a 0.300 average - a total failure, not a degradation. It is a dense pure-mathematics page, and Nougat fell into its documented repetition loop, emitting 'Let C be a finite graph and let C be a finite graph' over and over instead of reading the page. It is the only page of the 18 to do so, and roughly 1% of the corpus triggered the same guard during the build. We detect it by scanning for a repeated n-gram and keep only the healthy prefix, so the loop cannot reach the index - but the page is still lost.</w:t>
+            </w:r>
+          </w:p>
+          <w:p>
+            <w:r>
+              <w:t>Retrieval: 50 of 150 sampled queries never surfaced their gold evidence page in the top 10, and these concentrate on S3. The read is that a question about what a figure SHOWS shares little surface vocabulary with the caption text that represents it, so a dense embedder ranks topically similar prose above the region that actually holds the number. This is precisely what reranking and evidence-gated re-search are for in A3, and it is why rerank is a triggered gated component for us rather than an optional extra.</w:t>
             </w:r>
           </w:p>
         </w:tc>
@@ -2220,7 +2219,12 @@
           <w:p>
             <w:r/>
             <w:r>
-              <w:t>The biggest risk is memorisation, and it is specific to our corpus: these are real arXiv papers, so the answering model has very likely seen them in pretraining and can produce a plausible number from parametric memory without reading the page at all - which looks like success and is not. Our first move is the memorisation probe: re-run a sample with the page image withheld and treat anything still answered correctly as a warning, not a win. The second risk is more ordinary: our retrieval misses concentrate on figure-evidence questions, where a question about what a figure SHOWS shares little surface vocabulary with the caption that represents it. The reranker is the first fix; if it is not enough, the answer is to index a short VLM-written description of each figure region alongside its transcription.</w:t>
+              <w:t>We already measured it, and it is not a guess. The mandatory agentic behaviour fires when top_score &lt; weak_threshold, and our config ships weak_threshold=0.35 - but across 150 sampled queries the top-1 bge similarity ranged 0.494 to 0.812, mean 0.664. NOT ONE query fell below 0.35, so evidence-gated re-search would never execute and the A3 gate would fail closed. Worse, the failures do not separate by score: the 50 queries whose gold page never appeared in the top 10 scored 0.494-0.741 (median 0.623) against an overall mean of 0.664, so an absolute cut cannot distinguish them at all. The fix in A3 is a RELATIVE test - the margin between top-1 and top-k, or the cross-encoder score after reranking, which is calibrated in a way raw cosine similarity is not. Finding this now is the single most valuable thing A2 told us about A3.</w:t>
+            </w:r>
+          </w:p>
+          <w:p>
+            <w:r>
+              <w:t>The second risk is memorisation, and it is specific to our corpus: these are real arXiv papers, so the answering model has very likely seen them in pretraining and can produce a plausible number from parametric memory without reading the page at all - which looks like success and is not. Our first move is the memorisation probe: re-run a sample with the page image withheld and treat anything still answered correctly as a warning, not a win. The second risk is more ordinary: our retrieval misses concentrate on figure-evidence questions, where a question about what a figure SHOWS shares little surface vocabulary with the caption that represents it. The reranker is the first fix; if it is not enough, the answer is to index a short VLM-written description of each figure region alongside its transcription.</w:t>
             </w:r>
           </w:p>
         </w:tc>

</xml_diff>